<commit_message>
small changed to doc
</commit_message>
<xml_diff>
--- a/assignment_2_report.docx
+++ b/assignment_2_report.docx
@@ -4,7 +4,7 @@
   <w:body>
     <w:p>
       <w:pPr>
-        <w:jc w:val="center"/>
+        <w:ind w:left="720"/>
         <w:rPr>
           <w:b/>
           <w:bCs/>
@@ -13,10 +13,7 @@
           <w:szCs w:val="32"/>
         </w:rPr>
       </w:pPr>
-    </w:p>
-    <w:p>
-      <w:pPr>
-        <w:jc w:val="center"/>
+      <w:r>
         <w:rPr>
           <w:b/>
           <w:bCs/>
@@ -24,39 +21,6 @@
           <w:sz w:val="32"/>
           <w:szCs w:val="32"/>
         </w:rPr>
-      </w:pPr>
-    </w:p>
-    <w:p>
-      <w:pPr>
-        <w:jc w:val="center"/>
-        <w:rPr>
-          <w:b/>
-          <w:bCs/>
-          <w:color w:val="EE0000"/>
-          <w:sz w:val="32"/>
-          <w:szCs w:val="32"/>
-        </w:rPr>
-      </w:pPr>
-    </w:p>
-    <w:p>
-      <w:pPr>
-        <w:jc w:val="center"/>
-        <w:rPr>
-          <w:b/>
-          <w:bCs/>
-          <w:color w:val="EE0000"/>
-          <w:sz w:val="32"/>
-          <w:szCs w:val="32"/>
-        </w:rPr>
-      </w:pPr>
-      <w:r>
-        <w:rPr>
-          <w:b/>
-          <w:bCs/>
-          <w:color w:val="EE0000"/>
-          <w:sz w:val="32"/>
-          <w:szCs w:val="32"/>
-        </w:rPr>
         <w:t xml:space="preserve">Security in Computing and Information Technology </w:t>
       </w:r>
     </w:p>
@@ -313,61 +277,22 @@
           <w:sz w:val="24"/>
           <w:szCs w:val="24"/>
         </w:rPr>
-        <w:t xml:space="preserve"> = lcm(p-</w:t>
-      </w:r>
-      <w:proofErr w:type="gramStart"/>
-      <w:r>
-        <w:rPr>
-          <w:sz w:val="24"/>
-          <w:szCs w:val="24"/>
-        </w:rPr>
-        <w:t>1,q</w:t>
-      </w:r>
-      <w:proofErr w:type="gramEnd"/>
-      <w:r>
-        <w:rPr>
-          <w:sz w:val="24"/>
-          <w:szCs w:val="24"/>
-        </w:rPr>
-        <w:t>-1)</w:t>
-      </w:r>
-    </w:p>
-    <w:p>
-      <w:pPr>
-        <w:rPr>
-          <w:sz w:val="24"/>
-          <w:szCs w:val="24"/>
-        </w:rPr>
-      </w:pPr>
-      <w:r>
-        <w:rPr>
-          <w:sz w:val="24"/>
-          <w:szCs w:val="24"/>
-        </w:rPr>
-        <w:t>λ</w:t>
-      </w:r>
-      <w:r>
-        <w:rPr>
-          <w:sz w:val="24"/>
-          <w:szCs w:val="24"/>
-        </w:rPr>
-        <w:t xml:space="preserve"> = </w:t>
-      </w:r>
-      <w:proofErr w:type="gramStart"/>
-      <w:r>
-        <w:rPr>
-          <w:sz w:val="24"/>
-          <w:szCs w:val="24"/>
-        </w:rPr>
-        <w:t>lcm(</w:t>
-      </w:r>
-      <w:proofErr w:type="gramEnd"/>
-      <w:r>
-        <w:rPr>
-          <w:sz w:val="24"/>
-          <w:szCs w:val="24"/>
-        </w:rPr>
-        <w:t xml:space="preserve">107-1, 61-1) </w:t>
+        <w:t xml:space="preserve"> = lcm(p-1,q-1)</w:t>
+      </w:r>
+    </w:p>
+    <w:p>
+      <w:pPr>
+        <w:rPr>
+          <w:sz w:val="24"/>
+          <w:szCs w:val="24"/>
+        </w:rPr>
+      </w:pPr>
+      <w:r>
+        <w:rPr>
+          <w:sz w:val="24"/>
+          <w:szCs w:val="24"/>
+        </w:rPr>
+        <w:t xml:space="preserve">λ = lcm(107-1, 61-1) </w:t>
       </w:r>
       <w:r>
         <w:rPr>
@@ -381,37 +306,7 @@
           <w:sz w:val="24"/>
           <w:szCs w:val="24"/>
         </w:rPr>
-        <w:t xml:space="preserve"> </w:t>
-      </w:r>
-      <w:r>
-        <w:rPr>
-          <w:sz w:val="24"/>
-          <w:szCs w:val="24"/>
-        </w:rPr>
-        <w:t>λ</w:t>
-      </w:r>
-      <w:r>
-        <w:rPr>
-          <w:sz w:val="24"/>
-          <w:szCs w:val="24"/>
-        </w:rPr>
-        <w:t xml:space="preserve"> = </w:t>
-      </w:r>
-      <w:proofErr w:type="gramStart"/>
-      <w:r>
-        <w:rPr>
-          <w:sz w:val="24"/>
-          <w:szCs w:val="24"/>
-        </w:rPr>
-        <w:t>lcm(</w:t>
-      </w:r>
-      <w:proofErr w:type="gramEnd"/>
-      <w:r>
-        <w:rPr>
-          <w:sz w:val="24"/>
-          <w:szCs w:val="24"/>
-        </w:rPr>
-        <w:t>106,60)</w:t>
+        <w:t xml:space="preserve"> λ = lcm(106,60)</w:t>
       </w:r>
     </w:p>
     <w:p>
@@ -427,15 +322,7 @@
           <w:szCs w:val="24"/>
           <w:highlight w:val="yellow"/>
         </w:rPr>
-        <w:t>λ</w:t>
-      </w:r>
-      <w:r>
-        <w:rPr>
-          <w:sz w:val="24"/>
-          <w:szCs w:val="24"/>
-          <w:highlight w:val="yellow"/>
-        </w:rPr>
-        <w:t xml:space="preserve"> = </w:t>
+        <w:t xml:space="preserve">λ = </w:t>
       </w:r>
       <w:r>
         <w:rPr>
@@ -842,15 +729,7 @@
                 <w:sz w:val="24"/>
                 <w:szCs w:val="24"/>
               </w:rPr>
-              <m:t>33568362</m:t>
-            </m:r>
-            <m:r>
-              <w:rPr>
-                <w:rFonts w:ascii="Cambria Math" w:eastAsiaTheme="minorEastAsia" w:hAnsi="Cambria Math"/>
-                <w:sz w:val="24"/>
-                <w:szCs w:val="24"/>
-              </w:rPr>
-              <m:t>-1</m:t>
+              <m:t>33568362-1</m:t>
             </m:r>
           </m:num>
           <m:den>
@@ -961,15 +840,7 @@
           <w:szCs w:val="24"/>
           <w:highlight w:val="yellow"/>
         </w:rPr>
-        <w:t>µ</w:t>
-      </w:r>
-      <w:r>
-        <w:rPr>
-          <w:sz w:val="24"/>
-          <w:szCs w:val="24"/>
-          <w:highlight w:val="yellow"/>
-        </w:rPr>
-        <w:t xml:space="preserve"> = 6145</w:t>
+        <w:t>µ = 6145</w:t>
       </w:r>
     </w:p>
     <w:p>
@@ -988,115 +859,52 @@
           <w:sz w:val="24"/>
           <w:szCs w:val="24"/>
         </w:rPr>
-        <w:t>private</w:t>
-      </w:r>
-      <w:r>
-        <w:rPr>
+        <w:t xml:space="preserve">private key: </w:t>
+      </w:r>
+      <w:r>
+        <w:rPr>
+          <w:color w:val="0070C0"/>
+          <w:sz w:val="24"/>
+          <w:szCs w:val="24"/>
+        </w:rPr>
+        <w:t>(3180,6145)</w:t>
+      </w:r>
+    </w:p>
+    <w:p>
+      <w:pPr>
+        <w:rPr>
+          <w:rFonts w:eastAsiaTheme="minorEastAsia"/>
+          <w:sz w:val="24"/>
+          <w:szCs w:val="24"/>
+        </w:rPr>
+      </w:pPr>
+      <w:r>
+        <w:rPr>
+          <w:rFonts w:eastAsiaTheme="minorEastAsia"/>
           <w:b/>
           <w:bCs/>
-          <w:color w:val="0070C0"/>
-          <w:sz w:val="24"/>
-          <w:szCs w:val="24"/>
-        </w:rPr>
-        <w:t xml:space="preserve"> key: </w:t>
-      </w:r>
-      <w:r>
-        <w:rPr>
-          <w:color w:val="0070C0"/>
-          <w:sz w:val="24"/>
-          <w:szCs w:val="24"/>
-        </w:rPr>
-        <w:t>(</w:t>
-      </w:r>
-      <w:r>
-        <w:rPr>
-          <w:color w:val="0070C0"/>
-          <w:sz w:val="24"/>
-          <w:szCs w:val="24"/>
-        </w:rPr>
-        <w:t>3180</w:t>
-      </w:r>
-      <w:r>
-        <w:rPr>
-          <w:color w:val="0070C0"/>
-          <w:sz w:val="24"/>
-          <w:szCs w:val="24"/>
-        </w:rPr>
-        <w:t>,</w:t>
-      </w:r>
-      <w:r>
-        <w:rPr>
-          <w:color w:val="0070C0"/>
-          <w:sz w:val="24"/>
-          <w:szCs w:val="24"/>
-        </w:rPr>
-        <w:t>6145</w:t>
-      </w:r>
-      <w:r>
-        <w:rPr>
-          <w:color w:val="0070C0"/>
-          <w:sz w:val="24"/>
-          <w:szCs w:val="24"/>
-        </w:rPr>
-        <w:t>)</w:t>
-      </w:r>
-    </w:p>
-    <w:p>
-      <w:pPr>
-        <w:rPr>
-          <w:rFonts w:eastAsiaTheme="minorEastAsia"/>
-          <w:sz w:val="24"/>
-          <w:szCs w:val="24"/>
-        </w:rPr>
-      </w:pPr>
-      <w:r>
-        <w:rPr>
-          <w:rFonts w:eastAsiaTheme="minorEastAsia"/>
-          <w:b/>
-          <w:bCs/>
+          <w:sz w:val="24"/>
+          <w:szCs w:val="24"/>
+        </w:rPr>
+        <w:t>Encryption of Individual Votes Using the Paillier Cryptosystem</w:t>
+      </w:r>
+    </w:p>
+    <w:p>
+      <w:pPr>
+        <w:rPr>
+          <w:rFonts w:eastAsiaTheme="minorEastAsia"/>
+          <w:sz w:val="24"/>
+          <w:szCs w:val="24"/>
+        </w:rPr>
+      </w:pPr>
+      <w:r>
+        <w:rPr>
+          <w:rFonts w:eastAsiaTheme="minorEastAsia"/>
+          <w:noProof/>
           <w:sz w:val="24"/>
           <w:szCs w:val="24"/>
         </w:rPr>
         <w:lastRenderedPageBreak/>
-        <w:t xml:space="preserve">Encryption of Individual Votes Using the </w:t>
-      </w:r>
-      <w:proofErr w:type="spellStart"/>
-      <w:r>
-        <w:rPr>
-          <w:rFonts w:eastAsiaTheme="minorEastAsia"/>
-          <w:b/>
-          <w:bCs/>
-          <w:sz w:val="24"/>
-          <w:szCs w:val="24"/>
-        </w:rPr>
-        <w:t>Paillier</w:t>
-      </w:r>
-      <w:proofErr w:type="spellEnd"/>
-      <w:r>
-        <w:rPr>
-          <w:rFonts w:eastAsiaTheme="minorEastAsia"/>
-          <w:b/>
-          <w:bCs/>
-          <w:sz w:val="24"/>
-          <w:szCs w:val="24"/>
-        </w:rPr>
-        <w:t xml:space="preserve"> Cryptosystem</w:t>
-      </w:r>
-    </w:p>
-    <w:p>
-      <w:pPr>
-        <w:rPr>
-          <w:rFonts w:eastAsiaTheme="minorEastAsia"/>
-          <w:sz w:val="24"/>
-          <w:szCs w:val="24"/>
-        </w:rPr>
-      </w:pPr>
-      <w:r>
-        <w:rPr>
-          <w:rFonts w:eastAsiaTheme="minorEastAsia"/>
-          <w:sz w:val="24"/>
-          <w:szCs w:val="24"/>
-        </w:rPr>
         <w:drawing>
           <wp:inline distT="0" distB="0" distL="0" distR="0" wp14:anchorId="76882549" wp14:editId="1BCB9C4B">
             <wp:extent cx="5731510" cy="2493010"/>
@@ -1548,16 +1356,7 @@
               <w:szCs w:val="24"/>
               <w:highlight w:val="yellow"/>
             </w:rPr>
-            <m:t>=</m:t>
-          </m:r>
-          <m:r>
-            <w:rPr>
-              <w:rFonts w:ascii="Cambria Math" w:eastAsiaTheme="minorEastAsia" w:hAnsi="Cambria Math"/>
-              <w:sz w:val="24"/>
-              <w:szCs w:val="24"/>
-              <w:highlight w:val="yellow"/>
-            </w:rPr>
-            <m:t>22787030</m:t>
+            <m:t>=22787030</m:t>
           </m:r>
         </m:oMath>
       </m:oMathPara>
@@ -1994,16 +1793,7 @@
               <w:szCs w:val="24"/>
               <w:highlight w:val="yellow"/>
             </w:rPr>
-            <m:t>=</m:t>
-          </m:r>
-          <m:r>
-            <w:rPr>
-              <w:rFonts w:ascii="Cambria Math" w:eastAsiaTheme="minorEastAsia" w:hAnsi="Cambria Math"/>
-              <w:sz w:val="24"/>
-              <w:szCs w:val="24"/>
-              <w:highlight w:val="yellow"/>
-            </w:rPr>
-            <m:t>6155676</m:t>
+            <m:t>=6155676</m:t>
           </m:r>
         </m:oMath>
       </m:oMathPara>
@@ -2422,16 +2212,7 @@
               <w:szCs w:val="24"/>
               <w:highlight w:val="yellow"/>
             </w:rPr>
-            <m:t>=</m:t>
-          </m:r>
-          <m:r>
-            <w:rPr>
-              <w:rFonts w:ascii="Cambria Math" w:eastAsiaTheme="minorEastAsia" w:hAnsi="Cambria Math"/>
-              <w:sz w:val="24"/>
-              <w:szCs w:val="24"/>
-              <w:highlight w:val="yellow"/>
-            </w:rPr>
-            <m:t>26435665</m:t>
+            <m:t>=26435665</m:t>
           </m:r>
         </m:oMath>
       </m:oMathPara>
@@ -2850,16 +2631,7 @@
               <w:szCs w:val="24"/>
               <w:highlight w:val="yellow"/>
             </w:rPr>
-            <m:t>=</m:t>
-          </m:r>
-          <m:r>
-            <w:rPr>
-              <w:rFonts w:ascii="Cambria Math" w:eastAsiaTheme="minorEastAsia" w:hAnsi="Cambria Math"/>
-              <w:sz w:val="24"/>
-              <w:szCs w:val="24"/>
-              <w:highlight w:val="yellow"/>
-            </w:rPr>
-            <m:t>5713316</m:t>
+            <m:t>=5713316</m:t>
           </m:r>
         </m:oMath>
       </m:oMathPara>
@@ -3169,15 +2941,7 @@
                   <w:sz w:val="24"/>
                   <w:szCs w:val="24"/>
                 </w:rPr>
-                <m:t>7</m:t>
-              </m:r>
-              <m:r>
-                <w:rPr>
-                  <w:rFonts w:ascii="Cambria Math" w:eastAsiaTheme="minorEastAsia" w:hAnsi="Cambria Math"/>
-                  <w:sz w:val="24"/>
-                  <w:szCs w:val="24"/>
-                </w:rPr>
-                <m:t>5</m:t>
+                <m:t>75</m:t>
               </m:r>
             </m:e>
             <m:sup>
@@ -3286,16 +3050,7 @@
               <w:szCs w:val="24"/>
               <w:highlight w:val="yellow"/>
             </w:rPr>
-            <m:t>=</m:t>
-          </m:r>
-          <m:r>
-            <w:rPr>
-              <w:rFonts w:ascii="Cambria Math" w:eastAsiaTheme="minorEastAsia" w:hAnsi="Cambria Math"/>
-              <w:sz w:val="24"/>
-              <w:szCs w:val="24"/>
-              <w:highlight w:val="yellow"/>
-            </w:rPr>
-            <m:t>35730009</m:t>
+            <m:t>=35730009</m:t>
           </m:r>
         </m:oMath>
       </m:oMathPara>
@@ -3605,15 +3360,7 @@
                   <w:sz w:val="24"/>
                   <w:szCs w:val="24"/>
                 </w:rPr>
-                <m:t>7</m:t>
-              </m:r>
-              <m:r>
-                <w:rPr>
-                  <w:rFonts w:ascii="Cambria Math" w:eastAsiaTheme="minorEastAsia" w:hAnsi="Cambria Math"/>
-                  <w:sz w:val="24"/>
-                  <w:szCs w:val="24"/>
-                </w:rPr>
-                <m:t>6</m:t>
+                <m:t>76</m:t>
               </m:r>
             </m:e>
             <m:sup>
@@ -3722,16 +3469,7 @@
               <w:szCs w:val="24"/>
               <w:highlight w:val="yellow"/>
             </w:rPr>
-            <m:t>=</m:t>
-          </m:r>
-          <m:r>
-            <w:rPr>
-              <w:rFonts w:ascii="Cambria Math" w:eastAsiaTheme="minorEastAsia" w:hAnsi="Cambria Math"/>
-              <w:sz w:val="24"/>
-              <w:szCs w:val="24"/>
-              <w:highlight w:val="yellow"/>
-            </w:rPr>
-            <m:t>22037180</m:t>
+            <m:t>=22037180</m:t>
           </m:r>
         </m:oMath>
       </m:oMathPara>
@@ -4150,16 +3888,7 @@
               <w:szCs w:val="24"/>
               <w:highlight w:val="yellow"/>
             </w:rPr>
-            <m:t>=</m:t>
-          </m:r>
-          <m:r>
-            <w:rPr>
-              <w:rFonts w:ascii="Cambria Math" w:eastAsiaTheme="minorEastAsia" w:hAnsi="Cambria Math"/>
-              <w:sz w:val="24"/>
-              <w:szCs w:val="24"/>
-              <w:highlight w:val="yellow"/>
-            </w:rPr>
-            <m:t>30448834</m:t>
+            <m:t>=30448834</m:t>
           </m:r>
         </m:oMath>
       </m:oMathPara>
@@ -4578,16 +4307,7 @@
               <w:szCs w:val="24"/>
               <w:highlight w:val="yellow"/>
             </w:rPr>
-            <m:t>=35</m:t>
-          </m:r>
-          <m:r>
-            <w:rPr>
-              <w:rFonts w:ascii="Cambria Math" w:eastAsiaTheme="minorEastAsia" w:hAnsi="Cambria Math"/>
-              <w:sz w:val="24"/>
-              <w:szCs w:val="24"/>
-              <w:highlight w:val="yellow"/>
-            </w:rPr>
-            <m:t>591</m:t>
+            <m:t>=35591</m:t>
           </m:r>
         </m:oMath>
       </m:oMathPara>
@@ -5006,16 +4726,7 @@
               <w:szCs w:val="24"/>
               <w:highlight w:val="yellow"/>
             </w:rPr>
-            <m:t>=3</m:t>
-          </m:r>
-          <m:r>
-            <w:rPr>
-              <w:rFonts w:ascii="Cambria Math" w:eastAsiaTheme="minorEastAsia" w:hAnsi="Cambria Math"/>
-              <w:sz w:val="24"/>
-              <w:szCs w:val="24"/>
-              <w:highlight w:val="yellow"/>
-            </w:rPr>
-            <m:t>1639803</m:t>
+            <m:t>=31639803</m:t>
           </m:r>
         </m:oMath>
       </m:oMathPara>
@@ -5435,16 +5146,7 @@
               <w:szCs w:val="24"/>
               <w:highlight w:val="yellow"/>
             </w:rPr>
-            <m:t>=</m:t>
-          </m:r>
-          <m:r>
-            <w:rPr>
-              <w:rFonts w:ascii="Cambria Math" w:eastAsiaTheme="minorEastAsia" w:hAnsi="Cambria Math"/>
-              <w:sz w:val="24"/>
-              <w:szCs w:val="24"/>
-              <w:highlight w:val="yellow"/>
-            </w:rPr>
-            <m:t>28502453</m:t>
+            <m:t>=28502453</m:t>
           </m:r>
         </m:oMath>
       </m:oMathPara>
@@ -5899,15 +5601,7 @@
                 <w:sz w:val="24"/>
                 <w:szCs w:val="24"/>
               </w:rPr>
-              <m:t>1</m:t>
-            </m:r>
-            <m:r>
-              <w:rPr>
-                <w:rFonts w:ascii="Cambria Math" w:eastAsiaTheme="minorEastAsia" w:hAnsi="Cambria Math"/>
-                <w:sz w:val="24"/>
-                <w:szCs w:val="24"/>
-              </w:rPr>
-              <m:t>0</m:t>
+              <m:t>10</m:t>
             </m:r>
           </m:sub>
         </m:sSub>
@@ -5992,39 +5686,7 @@
                   <w:sz w:val="24"/>
                   <w:szCs w:val="24"/>
                 </w:rPr>
-                <m:t>C=&amp;(22 787 03</m:t>
-              </m:r>
-              <m:r>
-                <w:rPr>
-                  <w:rFonts w:ascii="Cambria Math" w:eastAsiaTheme="minorEastAsia" w:hAnsi="Cambria Math"/>
-                  <w:sz w:val="24"/>
-                  <w:szCs w:val="24"/>
-                </w:rPr>
-                <m:t xml:space="preserve">0* </m:t>
-              </m:r>
-              <m:r>
-                <w:rPr>
-                  <w:rFonts w:ascii="Cambria Math" w:eastAsiaTheme="minorEastAsia" w:hAnsi="Cambria Math"/>
-                  <w:sz w:val="24"/>
-                  <w:szCs w:val="24"/>
-                </w:rPr>
-                <m:t>6 155 676</m:t>
-              </m:r>
-              <m:r>
-                <w:rPr>
-                  <w:rFonts w:ascii="Cambria Math" w:eastAsiaTheme="minorEastAsia" w:hAnsi="Cambria Math"/>
-                  <w:sz w:val="24"/>
-                  <w:szCs w:val="24"/>
-                </w:rPr>
-                <m:t>*</m:t>
-              </m:r>
-              <m:r>
-                <w:rPr>
-                  <w:rFonts w:ascii="Cambria Math" w:eastAsiaTheme="minorEastAsia" w:hAnsi="Cambria Math"/>
-                  <w:sz w:val="24"/>
-                  <w:szCs w:val="24"/>
-                </w:rPr>
-                <m:t>26 435 665</m:t>
+                <m:t>C=&amp;(22 787 030* 6 155 676*26 435 665</m:t>
               </m:r>
             </m:e>
             <m:e>
@@ -6034,55 +5696,7 @@
                   <w:sz w:val="24"/>
                   <w:szCs w:val="24"/>
                 </w:rPr>
-                <m:t>&amp;</m:t>
-              </m:r>
-              <m:r>
-                <w:rPr>
-                  <w:rFonts w:ascii="Cambria Math" w:eastAsiaTheme="minorEastAsia" w:hAnsi="Cambria Math"/>
-                  <w:sz w:val="24"/>
-                  <w:szCs w:val="24"/>
-                </w:rPr>
-                <m:t xml:space="preserve">* </m:t>
-              </m:r>
-              <m:r>
-                <w:rPr>
-                  <w:rFonts w:ascii="Cambria Math" w:eastAsiaTheme="minorEastAsia" w:hAnsi="Cambria Math"/>
-                  <w:sz w:val="24"/>
-                  <w:szCs w:val="24"/>
-                </w:rPr>
-                <m:t>5 713 316</m:t>
-              </m:r>
-              <m:r>
-                <w:rPr>
-                  <w:rFonts w:ascii="Cambria Math" w:eastAsiaTheme="minorEastAsia" w:hAnsi="Cambria Math"/>
-                  <w:sz w:val="24"/>
-                  <w:szCs w:val="24"/>
-                </w:rPr>
-                <m:t xml:space="preserve">* </m:t>
-              </m:r>
-              <m:r>
-                <w:rPr>
-                  <w:rFonts w:ascii="Cambria Math" w:eastAsiaTheme="minorEastAsia" w:hAnsi="Cambria Math"/>
-                  <w:sz w:val="24"/>
-                  <w:szCs w:val="24"/>
-                </w:rPr>
-                <m:t>35 730 009</m:t>
-              </m:r>
-              <m:r>
-                <w:rPr>
-                  <w:rFonts w:ascii="Cambria Math" w:eastAsiaTheme="minorEastAsia" w:hAnsi="Cambria Math"/>
-                  <w:sz w:val="24"/>
-                  <w:szCs w:val="24"/>
-                </w:rPr>
-                <m:t xml:space="preserve">* </m:t>
-              </m:r>
-              <m:r>
-                <w:rPr>
-                  <w:rFonts w:ascii="Cambria Math" w:eastAsiaTheme="minorEastAsia" w:hAnsi="Cambria Math"/>
-                  <w:sz w:val="24"/>
-                  <w:szCs w:val="24"/>
-                </w:rPr>
-                <m:t>22 037 180</m:t>
+                <m:t>&amp;* 5 713 316* 35 730 009* 22 037 180</m:t>
               </m:r>
             </m:e>
             <m:e>
@@ -6092,55 +5706,7 @@
                   <w:sz w:val="24"/>
                   <w:szCs w:val="24"/>
                 </w:rPr>
-                <m:t>&amp;</m:t>
-              </m:r>
-              <m:r>
-                <w:rPr>
-                  <w:rFonts w:ascii="Cambria Math" w:eastAsiaTheme="minorEastAsia" w:hAnsi="Cambria Math"/>
-                  <w:sz w:val="24"/>
-                  <w:szCs w:val="24"/>
-                </w:rPr>
-                <m:t>*</m:t>
-              </m:r>
-              <m:r>
-                <w:rPr>
-                  <w:rFonts w:ascii="Cambria Math" w:eastAsiaTheme="minorEastAsia" w:hAnsi="Cambria Math"/>
-                  <w:sz w:val="24"/>
-                  <w:szCs w:val="24"/>
-                </w:rPr>
-                <m:t>30 448 834</m:t>
-              </m:r>
-              <m:r>
-                <w:rPr>
-                  <w:rFonts w:ascii="Cambria Math" w:eastAsiaTheme="minorEastAsia" w:hAnsi="Cambria Math"/>
-                  <w:sz w:val="24"/>
-                  <w:szCs w:val="24"/>
-                </w:rPr>
-                <m:t>*</m:t>
-              </m:r>
-              <m:r>
-                <w:rPr>
-                  <w:rFonts w:ascii="Cambria Math" w:eastAsiaTheme="minorEastAsia" w:hAnsi="Cambria Math"/>
-                  <w:sz w:val="24"/>
-                  <w:szCs w:val="24"/>
-                </w:rPr>
-                <m:t>35 591</m:t>
-              </m:r>
-              <m:r>
-                <w:rPr>
-                  <w:rFonts w:ascii="Cambria Math" w:eastAsiaTheme="minorEastAsia" w:hAnsi="Cambria Math"/>
-                  <w:sz w:val="24"/>
-                  <w:szCs w:val="24"/>
-                </w:rPr>
-                <m:t>*</m:t>
-              </m:r>
-              <m:r>
-                <w:rPr>
-                  <w:rFonts w:ascii="Cambria Math" w:eastAsiaTheme="minorEastAsia" w:hAnsi="Cambria Math"/>
-                  <w:sz w:val="24"/>
-                  <w:szCs w:val="24"/>
-                </w:rPr>
-                <m:t>31 639 803</m:t>
+                <m:t>&amp;*30 448 834*35 591*31 639 803</m:t>
               </m:r>
             </m:e>
             <m:e>
@@ -6150,23 +5716,7 @@
                   <w:sz w:val="24"/>
                   <w:szCs w:val="24"/>
                 </w:rPr>
-                <m:t>&amp;</m:t>
-              </m:r>
-              <m:r>
-                <w:rPr>
-                  <w:rFonts w:ascii="Cambria Math" w:eastAsiaTheme="minorEastAsia" w:hAnsi="Cambria Math"/>
-                  <w:sz w:val="24"/>
-                  <w:szCs w:val="24"/>
-                </w:rPr>
-                <m:t>*</m:t>
-              </m:r>
-              <m:r>
-                <w:rPr>
-                  <w:rFonts w:ascii="Cambria Math" w:eastAsiaTheme="minorEastAsia" w:hAnsi="Cambria Math"/>
-                  <w:sz w:val="24"/>
-                  <w:szCs w:val="24"/>
-                </w:rPr>
-                <m:t>28 502 453) </m:t>
+                <m:t>&amp;*28 502 453) </m:t>
               </m:r>
               <m:func>
                 <m:funcPr>
@@ -6634,15 +6184,7 @@
                 <w:sz w:val="24"/>
                 <w:szCs w:val="24"/>
               </w:rPr>
-              <m:t>2323613</m:t>
-            </m:r>
-            <m:r>
-              <w:rPr>
-                <w:rFonts w:ascii="Cambria Math" w:eastAsiaTheme="minorEastAsia" w:hAnsi="Cambria Math"/>
-                <w:sz w:val="24"/>
-                <w:szCs w:val="24"/>
-              </w:rPr>
-              <m:t>-1</m:t>
+              <m:t>2323613-1</m:t>
             </m:r>
           </m:num>
           <m:den>
@@ -6814,10 +6356,8 @@
           <w:sz w:val="24"/>
           <w:szCs w:val="24"/>
         </w:rPr>
-        <w:lastRenderedPageBreak/>
-        <w:t xml:space="preserve">Conversion of decrypted value into 12 </w:t>
-      </w:r>
-      <w:proofErr w:type="gramStart"/>
+        <w:t>Conversion of decrypted value into 12 bit</w:t>
+      </w:r>
       <w:r>
         <w:rPr>
           <w:b/>
@@ -6825,16 +6365,6 @@
           <w:sz w:val="24"/>
           <w:szCs w:val="24"/>
         </w:rPr>
-        <w:t>bit</w:t>
-      </w:r>
-      <w:proofErr w:type="gramEnd"/>
-      <w:r>
-        <w:rPr>
-          <w:b/>
-          <w:bCs/>
-          <w:sz w:val="24"/>
-          <w:szCs w:val="24"/>
-        </w:rPr>
         <w:t xml:space="preserve"> binary</w:t>
       </w:r>
     </w:p>
@@ -6850,6 +6380,7 @@
           <w:sz w:val="24"/>
           <w:szCs w:val="24"/>
         </w:rPr>
+        <w:lastRenderedPageBreak/>
         <w:t>The decrypted tally, (1075), is converted into binary by successively subtracting the largest power of two that does not exceed the remaining value:</w:t>
       </w:r>
     </w:p>
@@ -7760,39 +7291,7 @@
                   <w:sz w:val="24"/>
                   <w:szCs w:val="24"/>
                 </w:rPr>
-                <m:t>0100</m:t>
-              </m:r>
-              <m:r>
-                <w:rPr>
-                  <w:rFonts w:ascii="Cambria Math" w:hAnsi="Cambria Math"/>
-                  <w:sz w:val="24"/>
-                  <w:szCs w:val="24"/>
-                </w:rPr>
-                <m:t xml:space="preserve"> </m:t>
-              </m:r>
-              <m:r>
-                <w:rPr>
-                  <w:rFonts w:ascii="Cambria Math" w:hAnsi="Cambria Math"/>
-                  <w:sz w:val="24"/>
-                  <w:szCs w:val="24"/>
-                </w:rPr>
-                <m:t>0011</m:t>
-              </m:r>
-              <m:r>
-                <w:rPr>
-                  <w:rFonts w:ascii="Cambria Math" w:hAnsi="Cambria Math"/>
-                  <w:sz w:val="24"/>
-                  <w:szCs w:val="24"/>
-                </w:rPr>
-                <m:t xml:space="preserve"> </m:t>
-              </m:r>
-              <m:r>
-                <w:rPr>
-                  <w:rFonts w:ascii="Cambria Math" w:hAnsi="Cambria Math"/>
-                  <w:sz w:val="24"/>
-                  <w:szCs w:val="24"/>
-                </w:rPr>
-                <m:t>0011</m:t>
+                <m:t>0100 0011 0011</m:t>
               </m:r>
             </m:e>
             <m:sub>
@@ -8119,28 +7618,64 @@
           <w:sz w:val="24"/>
           <w:szCs w:val="24"/>
         </w:rPr>
-        <w:t>6</w:t>
-      </w:r>
-      <w:r>
-        <w:rPr>
+        <w:t>6a)</w:t>
+      </w:r>
+    </w:p>
+    <w:p>
+      <w:pPr>
+        <w:rPr>
+          <w:rFonts w:eastAsiaTheme="minorEastAsia"/>
           <w:b/>
           <w:bCs/>
-          <w:color w:val="EE0000"/>
-          <w:sz w:val="24"/>
-          <w:szCs w:val="24"/>
-        </w:rPr>
-        <w:t>a</w:t>
-      </w:r>
-      <w:r>
-        <w:rPr>
+          <w:sz w:val="24"/>
+          <w:szCs w:val="24"/>
+        </w:rPr>
+      </w:pPr>
+      <w:r>
+        <w:rPr>
+          <w:rFonts w:eastAsiaTheme="minorEastAsia"/>
           <w:b/>
           <w:bCs/>
-          <w:color w:val="EE0000"/>
-          <w:sz w:val="24"/>
-          <w:szCs w:val="24"/>
-        </w:rPr>
-        <w:t>)</w:t>
-      </w:r>
+          <w:sz w:val="24"/>
+          <w:szCs w:val="24"/>
+        </w:rPr>
+        <w:t>i. Significance (overview and scenarios)</w:t>
+      </w:r>
+    </w:p>
+    <w:p>
+      <w:pPr>
+        <w:rPr>
+          <w:rFonts w:eastAsiaTheme="minorEastAsia"/>
+          <w:sz w:val="24"/>
+          <w:szCs w:val="24"/>
+        </w:rPr>
+      </w:pPr>
+      <w:r>
+        <w:rPr>
+          <w:rFonts w:eastAsiaTheme="minorEastAsia"/>
+          <w:sz w:val="24"/>
+          <w:szCs w:val="24"/>
+        </w:rPr>
+        <w:t xml:space="preserve">When starting a creative project a writer dreams and imagines a world to escape theirs and captures moments and scenes that will draw a view into that world. What can hold a writer back is lack of equipment but RMIT offers a service to specific students within certain courses to loan equipment to capture what they could not before. The application form that currently exists is outdated and sees the user filling out a text field with what they desire to loan for their project. There is a separate website that is attached in the form that allows the user to see what equipment they can loan based on </w:t>
+      </w:r>
+      <w:r>
+        <w:rPr>
+          <w:rFonts w:eastAsiaTheme="minorEastAsia"/>
+          <w:sz w:val="24"/>
+          <w:szCs w:val="24"/>
+        </w:rPr>
+        <w:lastRenderedPageBreak/>
+        <w:t>their degree but the condition of the items and availability are not stated and can only be found after submission of the form.</w:t>
+      </w:r>
+    </w:p>
+    <w:p>
+      <w:pPr>
+        <w:rPr>
+          <w:rFonts w:eastAsiaTheme="minorEastAsia"/>
+          <w:sz w:val="24"/>
+          <w:szCs w:val="24"/>
+        </w:rPr>
+      </w:pPr>
     </w:p>
     <w:p>
       <w:pPr>
@@ -8152,7 +7687,6 @@
           <w:szCs w:val="24"/>
         </w:rPr>
       </w:pPr>
-      <w:proofErr w:type="spellStart"/>
       <w:r>
         <w:rPr>
           <w:rFonts w:eastAsiaTheme="minorEastAsia"/>
@@ -8161,127 +7695,6 @@
           <w:sz w:val="24"/>
           <w:szCs w:val="24"/>
         </w:rPr>
-        <w:t>i</w:t>
-      </w:r>
-      <w:proofErr w:type="spellEnd"/>
-      <w:r>
-        <w:rPr>
-          <w:rFonts w:eastAsiaTheme="minorEastAsia"/>
-          <w:b/>
-          <w:bCs/>
-          <w:sz w:val="24"/>
-          <w:szCs w:val="24"/>
-        </w:rPr>
-        <w:t>. Significance (overview and scenarios)</w:t>
-      </w:r>
-    </w:p>
-    <w:p>
-      <w:pPr>
-        <w:rPr>
-          <w:rFonts w:eastAsiaTheme="minorEastAsia"/>
-          <w:sz w:val="24"/>
-          <w:szCs w:val="24"/>
-        </w:rPr>
-      </w:pPr>
-      <w:r>
-        <w:rPr>
-          <w:rFonts w:eastAsiaTheme="minorEastAsia"/>
-          <w:sz w:val="24"/>
-          <w:szCs w:val="24"/>
-        </w:rPr>
-        <w:t xml:space="preserve">When starting a creative </w:t>
-      </w:r>
-      <w:proofErr w:type="gramStart"/>
-      <w:r>
-        <w:rPr>
-          <w:rFonts w:eastAsiaTheme="minorEastAsia"/>
-          <w:sz w:val="24"/>
-          <w:szCs w:val="24"/>
-        </w:rPr>
-        <w:t>project</w:t>
-      </w:r>
-      <w:proofErr w:type="gramEnd"/>
-      <w:r>
-        <w:rPr>
-          <w:rFonts w:eastAsiaTheme="minorEastAsia"/>
-          <w:sz w:val="24"/>
-          <w:szCs w:val="24"/>
-        </w:rPr>
-        <w:t xml:space="preserve"> a writer dreams and imagines a world to escape theirs and captures moments and scenes that will draw a view into that world. What can hold a writer back is lack of </w:t>
-      </w:r>
-      <w:proofErr w:type="gramStart"/>
-      <w:r>
-        <w:rPr>
-          <w:rFonts w:eastAsiaTheme="minorEastAsia"/>
-          <w:sz w:val="24"/>
-          <w:szCs w:val="24"/>
-        </w:rPr>
-        <w:t>equipment</w:t>
-      </w:r>
-      <w:proofErr w:type="gramEnd"/>
-      <w:r>
-        <w:rPr>
-          <w:rFonts w:eastAsiaTheme="minorEastAsia"/>
-          <w:sz w:val="24"/>
-          <w:szCs w:val="24"/>
-        </w:rPr>
-        <w:t xml:space="preserve"> but RMIT offers a service to specific students within certain courses to loan equipment to capture what they could not before. The application form that currently exists is outdated and sees the user filling out a text field </w:t>
-      </w:r>
-      <w:r>
-        <w:rPr>
-          <w:rFonts w:eastAsiaTheme="minorEastAsia"/>
-          <w:sz w:val="24"/>
-          <w:szCs w:val="24"/>
-        </w:rPr>
-        <w:lastRenderedPageBreak/>
-        <w:t xml:space="preserve">with what they desire to loan for their project. There is a separate website that is attached in the form that allows the user to see what equipment they can loan based on their </w:t>
-      </w:r>
-      <w:proofErr w:type="gramStart"/>
-      <w:r>
-        <w:rPr>
-          <w:rFonts w:eastAsiaTheme="minorEastAsia"/>
-          <w:sz w:val="24"/>
-          <w:szCs w:val="24"/>
-        </w:rPr>
-        <w:t>degree</w:t>
-      </w:r>
-      <w:proofErr w:type="gramEnd"/>
-      <w:r>
-        <w:rPr>
-          <w:rFonts w:eastAsiaTheme="minorEastAsia"/>
-          <w:sz w:val="24"/>
-          <w:szCs w:val="24"/>
-        </w:rPr>
-        <w:t xml:space="preserve"> but the condition of the items and availability are not stated and can only be found after submission of the form.</w:t>
-      </w:r>
-    </w:p>
-    <w:p>
-      <w:pPr>
-        <w:rPr>
-          <w:rFonts w:eastAsiaTheme="minorEastAsia"/>
-          <w:sz w:val="24"/>
-          <w:szCs w:val="24"/>
-        </w:rPr>
-      </w:pPr>
-    </w:p>
-    <w:p>
-      <w:pPr>
-        <w:rPr>
-          <w:rFonts w:eastAsiaTheme="minorEastAsia"/>
-          <w:b/>
-          <w:bCs/>
-          <w:sz w:val="24"/>
-          <w:szCs w:val="24"/>
-        </w:rPr>
-      </w:pPr>
-      <w:r>
-        <w:rPr>
-          <w:rFonts w:eastAsiaTheme="minorEastAsia"/>
-          <w:b/>
-          <w:bCs/>
-          <w:sz w:val="24"/>
-          <w:szCs w:val="24"/>
-        </w:rPr>
         <w:t>ii. Background (existing solutions)</w:t>
       </w:r>
     </w:p>
@@ -8299,133 +7712,7 @@
           <w:sz w:val="24"/>
           <w:szCs w:val="24"/>
         </w:rPr>
-        <w:t xml:space="preserve">The existing system is a </w:t>
-      </w:r>
-      <w:proofErr w:type="spellStart"/>
-      <w:r>
-        <w:rPr>
-          <w:rFonts w:eastAsiaTheme="minorEastAsia"/>
-          <w:sz w:val="24"/>
-          <w:szCs w:val="24"/>
-        </w:rPr>
-        <w:t>microsoft</w:t>
-      </w:r>
-      <w:proofErr w:type="spellEnd"/>
-      <w:r>
-        <w:rPr>
-          <w:rFonts w:eastAsiaTheme="minorEastAsia"/>
-          <w:sz w:val="24"/>
-          <w:szCs w:val="24"/>
-        </w:rPr>
-        <w:t xml:space="preserve"> form that is filled out by the student, the form consists of three pages, the first is what course the equipment is being used for. Then the next page requests contact details from the user and then finally the form asks what gear the student wants. The student is asked to be specific about the details for which gear they want the form has just a free-text box to list out each item they want without any reference other than a separate website with a spreadsheet of items, leading to missing items that are required to be stated in the form, they are then requested to fill in the collection date and drop off date and in additional comments. If they want to pick up at a specific </w:t>
-      </w:r>
-      <w:proofErr w:type="gramStart"/>
-      <w:r>
-        <w:rPr>
-          <w:rFonts w:eastAsiaTheme="minorEastAsia"/>
-          <w:sz w:val="24"/>
-          <w:szCs w:val="24"/>
-        </w:rPr>
-        <w:t>location</w:t>
-      </w:r>
-      <w:proofErr w:type="gramEnd"/>
-      <w:r>
-        <w:rPr>
-          <w:rFonts w:eastAsiaTheme="minorEastAsia"/>
-          <w:sz w:val="24"/>
-          <w:szCs w:val="24"/>
-        </w:rPr>
-        <w:t xml:space="preserve"> they tell us to specify which collection place then after which the form is submitted and within a few </w:t>
-      </w:r>
-      <w:proofErr w:type="gramStart"/>
-      <w:r>
-        <w:rPr>
-          <w:rFonts w:eastAsiaTheme="minorEastAsia"/>
-          <w:sz w:val="24"/>
-          <w:szCs w:val="24"/>
-        </w:rPr>
-        <w:t>days</w:t>
-      </w:r>
-      <w:proofErr w:type="gramEnd"/>
-      <w:r>
-        <w:rPr>
-          <w:rFonts w:eastAsiaTheme="minorEastAsia"/>
-          <w:sz w:val="24"/>
-          <w:szCs w:val="24"/>
-        </w:rPr>
-        <w:t xml:space="preserve"> they get confirmation of the requested gear and the collection date and drop off in accordance </w:t>
-      </w:r>
-      <w:proofErr w:type="gramStart"/>
-      <w:r>
-        <w:rPr>
-          <w:rFonts w:eastAsiaTheme="minorEastAsia"/>
-          <w:sz w:val="24"/>
-          <w:szCs w:val="24"/>
-        </w:rPr>
-        <w:t>to</w:t>
-      </w:r>
-      <w:proofErr w:type="gramEnd"/>
-      <w:r>
-        <w:rPr>
-          <w:rFonts w:eastAsiaTheme="minorEastAsia"/>
-          <w:sz w:val="24"/>
-          <w:szCs w:val="24"/>
-        </w:rPr>
-        <w:t xml:space="preserve"> availability and repairs. The form originates from a website called “</w:t>
-      </w:r>
-      <w:proofErr w:type="spellStart"/>
-      <w:r>
-        <w:rPr>
-          <w:rFonts w:eastAsiaTheme="minorEastAsia"/>
-          <w:sz w:val="24"/>
-          <w:szCs w:val="24"/>
-        </w:rPr>
-        <w:t>Techpoint</w:t>
-      </w:r>
-      <w:proofErr w:type="spellEnd"/>
-      <w:r>
-        <w:rPr>
-          <w:rFonts w:eastAsiaTheme="minorEastAsia"/>
-          <w:sz w:val="24"/>
-          <w:szCs w:val="24"/>
-        </w:rPr>
-        <w:t xml:space="preserve">” which uses Microsoft's software </w:t>
-      </w:r>
-      <w:proofErr w:type="spellStart"/>
-      <w:r>
-        <w:rPr>
-          <w:rFonts w:eastAsiaTheme="minorEastAsia"/>
-          <w:sz w:val="24"/>
-          <w:szCs w:val="24"/>
-        </w:rPr>
-        <w:t>sharepoint</w:t>
-      </w:r>
-      <w:proofErr w:type="spellEnd"/>
-      <w:r>
-        <w:rPr>
-          <w:rFonts w:eastAsiaTheme="minorEastAsia"/>
-          <w:sz w:val="24"/>
-          <w:szCs w:val="24"/>
-        </w:rPr>
-        <w:t xml:space="preserve"> to showcase all the equipment. </w:t>
-      </w:r>
-      <w:proofErr w:type="gramStart"/>
-      <w:r>
-        <w:rPr>
-          <w:rFonts w:eastAsiaTheme="minorEastAsia"/>
-          <w:sz w:val="24"/>
-          <w:szCs w:val="24"/>
-        </w:rPr>
-        <w:t>However</w:t>
-      </w:r>
-      <w:proofErr w:type="gramEnd"/>
-      <w:r>
-        <w:rPr>
-          <w:rFonts w:eastAsiaTheme="minorEastAsia"/>
-          <w:sz w:val="24"/>
-          <w:szCs w:val="24"/>
-        </w:rPr>
-        <w:t xml:space="preserve"> it does not show current or recent photos of the equipment but rather stock photos, this current solution to see all the equipment completely misses the existing damage and condition of the equipment and as well any repairs that have been done to the equipment. This has led to students returning damaged gear and being put to blame for the damage but also the experience of students hiring gear only for it to be in an undesirable condition. An image of the current form is attached below.</w:t>
+        <w:t>The existing system is a microsoft form that is filled out by the student, the form consists of three pages, the first is what course the equipment is being used for. Then the next page requests contact details from the user and then finally the form asks what gear the student wants. The student is asked to be specific about the details for which gear they want the form has just a free-text box to list out each item they want without any reference other than a separate website with a spreadsheet of items, leading to missing items that are required to be stated in the form, they are then requested to fill in the collection date and drop off date and in additional comments. If they want to pick up at a specific location they tell us to specify which collection place then after which the form is submitted and within a few days they get confirmation of the requested gear and the collection date and drop off in accordance to availability and repairs. The form originates from a website called “Techpoint” which uses Microsoft's software sharepoint to showcase all the equipment. However it does not show current or recent photos of the equipment but rather stock photos, this current solution to see all the equipment completely misses the existing damage and condition of the equipment and as well any repairs that have been done to the equipment. This has led to students returning damaged gear and being put to blame for the damage but also the experience of students hiring gear only for it to be in an undesirable condition. An image of the current form is attached below.</w:t>
       </w:r>
     </w:p>
     <w:p>
@@ -8464,6 +7751,7 @@
       <w:r>
         <w:rPr>
           <w:rFonts w:eastAsiaTheme="minorEastAsia"/>
+          <w:noProof/>
           <w:sz w:val="24"/>
           <w:szCs w:val="24"/>
         </w:rPr>
@@ -8550,25 +7838,7 @@
           <w:sz w:val="24"/>
           <w:szCs w:val="24"/>
         </w:rPr>
-        <w:t xml:space="preserve">When loaning equipment to create a </w:t>
-      </w:r>
-      <w:proofErr w:type="gramStart"/>
-      <w:r>
-        <w:rPr>
-          <w:rFonts w:eastAsiaTheme="minorEastAsia"/>
-          <w:sz w:val="24"/>
-          <w:szCs w:val="24"/>
-        </w:rPr>
-        <w:t>project</w:t>
-      </w:r>
-      <w:proofErr w:type="gramEnd"/>
-      <w:r>
-        <w:rPr>
-          <w:rFonts w:eastAsiaTheme="minorEastAsia"/>
-          <w:sz w:val="24"/>
-          <w:szCs w:val="24"/>
-        </w:rPr>
-        <w:t xml:space="preserve"> the process should be simple, RMIT is providing for beginners so helping and assisting in any way possible for new creators is the main objective. The Goal is to design a helpful, simpler and more transparent platform for students to loan gear from RMIT. To build on the helpfulness of this system the free-text input will be replaced by simple selectable items that will be able to be added to a cart also an availability timeframe is given for the selected gear. Users will be prompted with missing items or suggested kits that go with gear they have loaned like headphones or an SD card ensuring nothing is forgotten before submitting a request. To bring transparency to the system condition will be displayed with notes on any damages, as well repair history will be noted down. Within this system, automation can be introduced to reduce staff admin through automated approvals, with certain rules that will allow approvals and red flags that will require human review. As well when gear is assigned to a student the check in and check out times are timestamped into the records so disputes for pick up and drop off times are removed. Within these </w:t>
+        <w:t xml:space="preserve">When loaning equipment to create a project the process should be simple, RMIT is providing for beginners so helping and assisting in any way possible for new creators is the main objective. The Goal is to design a helpful, simpler and more transparent platform for students to loan gear from RMIT. To build on the helpfulness of this system the free-text input will be replaced by simple selectable items that will be able to be added to a cart also an availability timeframe is given for the selected gear. Users will be prompted with missing items or suggested kits that go with gear they have loaned like headphones or an SD card ensuring nothing is forgotten before submitting a request. To bring transparency to the system condition will be displayed with notes on any damages, as well repair history will be noted down. Within this system, automation can be introduced to reduce staff admin through automated approvals, with certain rules that will allow approvals and red flags that will require human review. As well when gear is assigned to a student the check in and check out times are timestamped into the records so disputes for pick up and drop off times are removed. Within these </w:t>
       </w:r>
       <w:r>
         <w:rPr>
@@ -8624,43 +7894,7 @@
           <w:sz w:val="24"/>
           <w:szCs w:val="24"/>
         </w:rPr>
-        <w:t xml:space="preserve">The new proposed system will use a private permissioned blockchain. Hyperledger Fabric is an enterprise grade permissioned distributed ledger technology that will allow for RMIT to allow for a private permissioned blockchain, giving them power over participants such as students, equipment staff and any repair technicians. Each item will receive its own on chain record, containing an ID, current photos of the equipment and last owner, the three of these will be stored on chain and off chain, with the </w:t>
-      </w:r>
-      <w:proofErr w:type="gramStart"/>
-      <w:r>
-        <w:rPr>
-          <w:rFonts w:eastAsiaTheme="minorEastAsia"/>
-          <w:sz w:val="24"/>
-          <w:szCs w:val="24"/>
-        </w:rPr>
-        <w:t>on chain</w:t>
-      </w:r>
-      <w:proofErr w:type="gramEnd"/>
-      <w:r>
-        <w:rPr>
-          <w:rFonts w:eastAsiaTheme="minorEastAsia"/>
-          <w:sz w:val="24"/>
-          <w:szCs w:val="24"/>
-        </w:rPr>
-        <w:t xml:space="preserve"> data being hashed. The chain will also hold condition information, repair history. For Smart Contracts there will be 4 rules to assist the team with automation. The first rule will be eligibility, allowing only students within specific courses to request items. To ensure there is no </w:t>
-      </w:r>
-      <w:proofErr w:type="gramStart"/>
-      <w:r>
-        <w:rPr>
-          <w:rFonts w:eastAsiaTheme="minorEastAsia"/>
-          <w:sz w:val="24"/>
-          <w:szCs w:val="24"/>
-        </w:rPr>
-        <w:t>double booking</w:t>
-      </w:r>
-      <w:proofErr w:type="gramEnd"/>
-      <w:r>
-        <w:rPr>
-          <w:rFonts w:eastAsiaTheme="minorEastAsia"/>
-          <w:sz w:val="24"/>
-          <w:szCs w:val="24"/>
-        </w:rPr>
-        <w:t xml:space="preserve"> availability and booking will be another part of the smart contract. For check in and check out, both the staff and loaning student must sign off on the condition of the equipment, photos will be timestamped to ensure accurate information on condition of equipment. The last rule will be to return reminders for the students, ensuring timely returns for equipment and as well reminding them to sign off on condition when returning. The student facing UI will get a complete overhaul, instead of the form that is currently used there will be an online store look for the loaning process, students will first be prompted to log in using RMIT’s SSO and based on their degree they will be able to select items to add to their cart, once all items are selected they are then prompted within their cart to select their required dates from a calendar. The calendar will show availability per item and show the best times for all the equipment that they have selected to be loaned. They are also able to select from selected kits, for example an ‘Outdoor Documentary Shoot’ including all necessary gear for a specific project without the hassle of selecting each item.</w:t>
+        <w:t>The new proposed system will use a private permissioned blockchain. Hyperledger Fabric is an enterprise grade permissioned distributed ledger technology that will allow for RMIT to allow for a private permissioned blockchain, giving them power over participants such as students, equipment staff and any repair technicians. Each item will receive its own on chain record, containing an ID, current photos of the equipment and last owner, the three of these will be stored on chain and off chain, with the on chain data being hashed. The chain will also hold condition information, repair history. For Smart Contracts there will be 4 rules to assist the team with automation. The first rule will be eligibility, allowing only students within specific courses to request items. To ensure there is no double booking availability and booking will be another part of the smart contract. For check in and check out, both the staff and loaning student must sign off on the condition of the equipment, photos will be timestamped to ensure accurate information on condition of equipment. The last rule will be to return reminders for the students, ensuring timely returns for equipment and as well reminding them to sign off on condition when returning. The student facing UI will get a complete overhaul, instead of the form that is currently used there will be an online store look for the loaning process, students will first be prompted to log in using RMIT’s SSO and based on their degree they will be able to select items to add to their cart, once all items are selected they are then prompted within their cart to select their required dates from a calendar. The calendar will show availability per item and show the best times for all the equipment that they have selected to be loaned. They are also able to select from selected kits, for example an ‘Outdoor Documentary Shoot’ including all necessary gear for a specific project without the hassle of selecting each item.</w:t>
       </w:r>
     </w:p>
     <w:p>
@@ -8707,87 +7941,33 @@
           <w:sz w:val="24"/>
           <w:szCs w:val="24"/>
         </w:rPr>
-        <w:t xml:space="preserve">The advantages for this system </w:t>
-      </w:r>
-      <w:proofErr w:type="gramStart"/>
-      <w:r>
-        <w:rPr>
-          <w:rFonts w:eastAsiaTheme="minorEastAsia"/>
-          <w:sz w:val="24"/>
-          <w:szCs w:val="24"/>
-        </w:rPr>
-        <w:t>is</w:t>
-      </w:r>
-      <w:proofErr w:type="gramEnd"/>
-      <w:r>
-        <w:rPr>
-          <w:rFonts w:eastAsiaTheme="minorEastAsia"/>
-          <w:sz w:val="24"/>
-          <w:szCs w:val="24"/>
-        </w:rPr>
-        <w:t xml:space="preserve"> complete transparency, students and staff </w:t>
-      </w:r>
-      <w:proofErr w:type="gramStart"/>
-      <w:r>
-        <w:rPr>
-          <w:rFonts w:eastAsiaTheme="minorEastAsia"/>
-          <w:sz w:val="24"/>
-          <w:szCs w:val="24"/>
-        </w:rPr>
-        <w:t>are able to</w:t>
-      </w:r>
-      <w:proofErr w:type="gramEnd"/>
-      <w:r>
-        <w:rPr>
-          <w:rFonts w:eastAsiaTheme="minorEastAsia"/>
-          <w:sz w:val="24"/>
-          <w:szCs w:val="24"/>
-        </w:rPr>
-        <w:t xml:space="preserve"> track the condition of the equipment without any dispute on who the damage is done by but a completely transparent system that tracks condition and repairs. There are also automated processes for the staff taking the strain of chasing equipment up but rather have the smart contract automate the work for the equipment staff.</w:t>
-      </w:r>
-    </w:p>
-    <w:p>
-      <w:pPr>
-        <w:rPr>
-          <w:rFonts w:eastAsiaTheme="minorEastAsia"/>
-          <w:sz w:val="24"/>
-          <w:szCs w:val="24"/>
-        </w:rPr>
-      </w:pPr>
-    </w:p>
-    <w:p>
-      <w:pPr>
-        <w:rPr>
-          <w:rFonts w:eastAsiaTheme="minorEastAsia"/>
-          <w:sz w:val="24"/>
-          <w:szCs w:val="24"/>
-        </w:rPr>
-      </w:pPr>
-      <w:r>
-        <w:rPr>
-          <w:rFonts w:eastAsiaTheme="minorEastAsia"/>
-          <w:sz w:val="24"/>
-          <w:szCs w:val="24"/>
-        </w:rPr>
-        <w:t xml:space="preserve">The system being designed is an in-depth and costly system for a very </w:t>
-      </w:r>
-      <w:proofErr w:type="gramStart"/>
-      <w:r>
-        <w:rPr>
-          <w:rFonts w:eastAsiaTheme="minorEastAsia"/>
-          <w:sz w:val="24"/>
-          <w:szCs w:val="24"/>
-        </w:rPr>
-        <w:t>small scale</w:t>
-      </w:r>
-      <w:proofErr w:type="gramEnd"/>
-      <w:r>
-        <w:rPr>
-          <w:rFonts w:eastAsiaTheme="minorEastAsia"/>
-          <w:sz w:val="24"/>
-          <w:szCs w:val="24"/>
-        </w:rPr>
-        <w:t xml:space="preserve"> service. The cost being a maintenance staff for this blockchain, cost of the service itself and as well the technical skills that will be required by the staff. RMIT uses Microsoft systems for a lot of processes and to get this proposed system to be integrated with </w:t>
+        <w:t>The advantages for this system is complete transparency, students and staff are able to track the condition of the equipment without any dispute on who the damage is done by but a completely transparent system that tracks condition and repairs. There are also automated processes for the staff taking the strain of chasing equipment up but rather have the smart contract automate the work for the equipment staff.</w:t>
+      </w:r>
+    </w:p>
+    <w:p>
+      <w:pPr>
+        <w:rPr>
+          <w:rFonts w:eastAsiaTheme="minorEastAsia"/>
+          <w:sz w:val="24"/>
+          <w:szCs w:val="24"/>
+        </w:rPr>
+      </w:pPr>
+    </w:p>
+    <w:p>
+      <w:pPr>
+        <w:rPr>
+          <w:rFonts w:eastAsiaTheme="minorEastAsia"/>
+          <w:sz w:val="24"/>
+          <w:szCs w:val="24"/>
+        </w:rPr>
+      </w:pPr>
+      <w:r>
+        <w:rPr>
+          <w:rFonts w:eastAsiaTheme="minorEastAsia"/>
+          <w:sz w:val="24"/>
+          <w:szCs w:val="24"/>
+        </w:rPr>
+        <w:t xml:space="preserve">The system being designed is an in-depth and costly system for a very small scale service. The cost being a maintenance staff for this blockchain, cost of the service itself and as well the technical skills that will be required by the staff. RMIT uses Microsoft systems for a lot of processes and to get this proposed system to be integrated with </w:t>
       </w:r>
       <w:r>
         <w:rPr>
@@ -8796,79 +7976,7 @@
           <w:szCs w:val="24"/>
         </w:rPr>
         <w:lastRenderedPageBreak/>
-        <w:t xml:space="preserve">RMIT systems will be a strenuous task to start up and also there will be concerns with the system making mistakes on </w:t>
-      </w:r>
-      <w:proofErr w:type="spellStart"/>
-      <w:r>
-        <w:rPr>
-          <w:rFonts w:eastAsiaTheme="minorEastAsia"/>
-          <w:sz w:val="24"/>
-          <w:szCs w:val="24"/>
-        </w:rPr>
-        <w:t>start up</w:t>
-      </w:r>
-      <w:proofErr w:type="spellEnd"/>
-      <w:r>
-        <w:rPr>
-          <w:rFonts w:eastAsiaTheme="minorEastAsia"/>
-          <w:sz w:val="24"/>
-          <w:szCs w:val="24"/>
-        </w:rPr>
-        <w:t xml:space="preserve"> and the cost of the mistake can be equipment upwards of </w:t>
-      </w:r>
-      <w:proofErr w:type="gramStart"/>
-      <w:r>
-        <w:rPr>
-          <w:rFonts w:eastAsiaTheme="minorEastAsia"/>
-          <w:sz w:val="24"/>
-          <w:szCs w:val="24"/>
-        </w:rPr>
-        <w:t>thousands</w:t>
-      </w:r>
-      <w:proofErr w:type="gramEnd"/>
-      <w:r>
-        <w:rPr>
-          <w:rFonts w:eastAsiaTheme="minorEastAsia"/>
-          <w:sz w:val="24"/>
-          <w:szCs w:val="24"/>
-        </w:rPr>
-        <w:t xml:space="preserve"> </w:t>
-      </w:r>
-      <w:proofErr w:type="spellStart"/>
-      <w:r>
-        <w:rPr>
-          <w:rFonts w:eastAsiaTheme="minorEastAsia"/>
-          <w:sz w:val="24"/>
-          <w:szCs w:val="24"/>
-        </w:rPr>
-        <w:t>dollars worth</w:t>
-      </w:r>
-      <w:proofErr w:type="spellEnd"/>
-      <w:r>
-        <w:rPr>
-          <w:rFonts w:eastAsiaTheme="minorEastAsia"/>
-          <w:sz w:val="24"/>
-          <w:szCs w:val="24"/>
-        </w:rPr>
-        <w:t xml:space="preserve"> of equipment. A </w:t>
-      </w:r>
-      <w:proofErr w:type="gramStart"/>
-      <w:r>
-        <w:rPr>
-          <w:rFonts w:eastAsiaTheme="minorEastAsia"/>
-          <w:sz w:val="24"/>
-          <w:szCs w:val="24"/>
-        </w:rPr>
-        <w:t>well designed</w:t>
-      </w:r>
-      <w:proofErr w:type="gramEnd"/>
-      <w:r>
-        <w:rPr>
-          <w:rFonts w:eastAsiaTheme="minorEastAsia"/>
-          <w:sz w:val="24"/>
-          <w:szCs w:val="24"/>
-        </w:rPr>
-        <w:t xml:space="preserve"> database could fix some of the problems stated within the background of the current solution but implementing blockchain strengthens the integrity of recorded damages with a clear audit trail of damage.</w:t>
+        <w:t>RMIT systems will be a strenuous task to start up and also there will be concerns with the system making mistakes on start up and the cost of the mistake can be equipment upwards of thousands dollars worth of equipment. A well designed database could fix some of the problems stated within the background of the current solution but implementing blockchain strengthens the integrity of recorded damages with a clear audit trail of damage.</w:t>
       </w:r>
     </w:p>
     <w:p>
@@ -8915,43 +8023,7 @@
           <w:sz w:val="24"/>
           <w:szCs w:val="24"/>
         </w:rPr>
-        <w:t xml:space="preserve">Nothing should hold a student back from their dream project and RMIT has offered a service that is helping students build these dream </w:t>
-      </w:r>
-      <w:proofErr w:type="gramStart"/>
-      <w:r>
-        <w:rPr>
-          <w:rFonts w:eastAsiaTheme="minorEastAsia"/>
-          <w:sz w:val="24"/>
-          <w:szCs w:val="24"/>
-        </w:rPr>
-        <w:t>projects</w:t>
-      </w:r>
-      <w:proofErr w:type="gramEnd"/>
-      <w:r>
-        <w:rPr>
-          <w:rFonts w:eastAsiaTheme="minorEastAsia"/>
-          <w:sz w:val="24"/>
-          <w:szCs w:val="24"/>
-        </w:rPr>
-        <w:t xml:space="preserve"> but the process can be simplified with the assistance of Blockchain. Within its current state students are loaning equipment blindly by submitting a form with little to information other than the equipment available to them, leaving students with equipment with undesired condition or with form submission without any confirmation of availability. The proposed solution gives students the freedom to scroll through the items and loan based on availability and condition of the item, leaving them with a more transparent and simpler system to loan equipment </w:t>
-      </w:r>
-      <w:proofErr w:type="gramStart"/>
-      <w:r>
-        <w:rPr>
-          <w:rFonts w:eastAsiaTheme="minorEastAsia"/>
-          <w:sz w:val="24"/>
-          <w:szCs w:val="24"/>
-        </w:rPr>
-        <w:t>and also</w:t>
-      </w:r>
-      <w:proofErr w:type="gramEnd"/>
-      <w:r>
-        <w:rPr>
-          <w:rFonts w:eastAsiaTheme="minorEastAsia"/>
-          <w:sz w:val="24"/>
-          <w:szCs w:val="24"/>
-        </w:rPr>
-        <w:t xml:space="preserve"> a simpler application for staff to track current and incoming loans.</w:t>
+        <w:t>Nothing should hold a student back from their dream project and RMIT has offered a service that is helping students build these dream projects but the process can be simplified with the assistance of Blockchain. Within its current state students are loaning equipment blindly by submitting a form with little to information other than the equipment available to them, leaving students with equipment with undesired condition or with form submission without any confirmation of availability. The proposed solution gives students the freedom to scroll through the items and loan based on availability and condition of the item, leaving them with a more transparent and simpler system to loan equipment and also a simpler application for staff to track current and incoming loans.</w:t>
       </w:r>
     </w:p>
     <w:p>
@@ -10054,13 +9126,7 @@
               <w:rPr>
                 <w:color w:val="0070C0"/>
               </w:rPr>
-              <w:t>J</w:t>
-            </w:r>
-            <w:r>
-              <w:rPr>
-                <w:color w:val="0070C0"/>
-              </w:rPr>
-              <w:t>S</w:t>
+              <w:t>JS</w:t>
             </w:r>
           </w:p>
         </w:tc>
@@ -10741,7 +9807,7 @@
                 <w:noProof/>
               </w:rPr>
               <w:drawing>
-                <wp:inline distT="0" distB="0" distL="0" distR="0" wp14:anchorId="520B6C60" wp14:editId="63239E0E">
+                <wp:inline distT="0" distB="0" distL="0" distR="0" wp14:anchorId="520B6C60" wp14:editId="4375DFBF">
                   <wp:extent cx="2770704" cy="2332966"/>
                   <wp:effectExtent l="0" t="0" r="0" b="0"/>
                   <wp:docPr id="2134671727" name="Picture 8"/>
@@ -10931,7 +9997,7 @@
                 <w:noProof/>
               </w:rPr>
               <w:drawing>
-                <wp:inline distT="0" distB="0" distL="0" distR="0" wp14:anchorId="6EAAD53B" wp14:editId="2BAD0605">
+                <wp:inline distT="0" distB="0" distL="0" distR="0" wp14:anchorId="6EAAD53B" wp14:editId="7A73B1B8">
                   <wp:extent cx="2816244" cy="2398144"/>
                   <wp:effectExtent l="0" t="0" r="3175" b="2540"/>
                   <wp:docPr id="646245518" name="Picture 9"/>
@@ -11046,27 +10112,7 @@
           <w:szCs w:val="24"/>
         </w:rPr>
         <w:lastRenderedPageBreak/>
-        <w:t>7.</w:t>
-      </w:r>
-      <w:r>
-        <w:rPr>
-          <w:b/>
-          <w:bCs/>
-          <w:color w:val="EE0000"/>
-          <w:sz w:val="24"/>
-          <w:szCs w:val="24"/>
-        </w:rPr>
-        <w:t>3</w:t>
-      </w:r>
-      <w:r>
-        <w:rPr>
-          <w:b/>
-          <w:bCs/>
-          <w:color w:val="EE0000"/>
-          <w:sz w:val="24"/>
-          <w:szCs w:val="24"/>
-        </w:rPr>
-        <w:t>)</w:t>
+        <w:t>7.3)</w:t>
       </w:r>
     </w:p>
     <w:p>
@@ -11182,6 +10228,7 @@
         <w:rPr>
           <w:b/>
           <w:bCs/>
+          <w:noProof/>
           <w:color w:val="0070C0"/>
           <w:sz w:val="24"/>
           <w:szCs w:val="24"/>
@@ -11267,6 +10314,7 @@
         <w:rPr>
           <w:b/>
           <w:bCs/>
+          <w:noProof/>
           <w:color w:val="0070C0"/>
           <w:sz w:val="24"/>
           <w:szCs w:val="24"/>
@@ -12025,6 +11073,7 @@
   <w:style w:type="character" w:default="1" w:styleId="DefaultParagraphFont">
     <w:name w:val="Default Paragraph Font"/>
     <w:uiPriority w:val="1"/>
+    <w:semiHidden/>
     <w:unhideWhenUsed/>
   </w:style>
   <w:style w:type="table" w:default="1" w:styleId="TableNormal">

</xml_diff>